<commit_message>
Fix BAP templates Word XML and add Detail Arsip page
</commit_message>
<xml_diff>
--- a/public/templates-bap/bap-industri.docx
+++ b/public/templates-bap/bap-industri.docx
@@ -1,5 +1,68 @@
 
-<file path=word/document.xml><?xml version="1.0" encoding="utf-8"?>
+<file path=customXml\item1.xml><?xml version="1.0" encoding="utf-8"?>
+<b:Sources xmlns:b="http://schemas.openxmlformats.org/officeDocument/2006/bibliography" xmlns="http://schemas.openxmlformats.org/officeDocument/2006/bibliography" SelectedStyle="\APASixthEditionOfficeOnline.xsl" StyleName="APA" Version="6"/>
+</file>
+
+<file path=customXml\itemProps1.xml><?xml version="1.0" encoding="utf-8"?>
+<ds:datastoreItem xmlns:ds="http://schemas.openxmlformats.org/officeDocument/2006/customXml" ds:itemID="{11F36BC6-CF5E-4B03-A8CB-9D32D749DADC}">
+  <ds:schemaRefs>
+    <ds:schemaRef ds:uri="http://schemas.openxmlformats.org/officeDocument/2006/bibliography"/>
+  </ds:schemaRefs>
+</ds:datastoreItem>
+</file>
+
+<file path=docProps\app.xml><?xml version="1.0" encoding="utf-8"?>
+<Properties xmlns="http://schemas.openxmlformats.org/officeDocument/2006/extended-properties" xmlns:vt="http://schemas.openxmlformats.org/officeDocument/2006/docPropsVTypes">
+  <Template>Normal.dotm</Template>
+  <TotalTime>706</TotalTime>
+  <Pages>7</Pages>
+  <Words>914</Words>
+  <Characters>5214</Characters>
+  <Application>Microsoft Office Word</Application>
+  <DocSecurity>0</DocSecurity>
+  <Lines>43</Lines>
+  <Paragraphs>12</Paragraphs>
+  <ScaleCrop>false</ScaleCrop>
+  <HeadingPairs>
+    <vt:vector size="2" baseType="variant">
+      <vt:variant>
+        <vt:lpstr>Title</vt:lpstr>
+      </vt:variant>
+      <vt:variant>
+        <vt:i4>1</vt:i4>
+      </vt:variant>
+    </vt:vector>
+  </HeadingPairs>
+  <TitlesOfParts>
+    <vt:vector size="1" baseType="lpstr">
+      <vt:lpstr/>
+    </vt:vector>
+  </TitlesOfParts>
+  <Company/>
+  <LinksUpToDate>false</LinksUpToDate>
+  <CharactersWithSpaces>6116</CharactersWithSpaces>
+  <SharedDoc>false</SharedDoc>
+  <HyperlinksChanged>false</HyperlinksChanged>
+  <AppVersion>16.0000</AppVersion>
+</Properties>
+</file>
+
+<file path=docProps\core.xml><?xml version="1.0" encoding="utf-8"?>
+<cp:coreProperties xmlns:cp="http://schemas.openxmlformats.org/package/2006/metadata/core-properties" xmlns:dc="http://purl.org/dc/elements/1.1/" xmlns:dcterms="http://purl.org/dc/terms/" xmlns:dcmitype="http://purl.org/dc/dcmitype/" xmlns:xsi="http://www.w3.org/2001/XMLSchema-instance">
+  <dc:title/>
+  <dc:subject/>
+  <dc:creator>DLH SRAGEN</dc:creator>
+  <cp:keywords/>
+  <dc:description/>
+  <cp:lastModifiedBy>Irfan Delix</cp:lastModifiedBy>
+  <cp:revision>41</cp:revision>
+  <cp:lastPrinted>2026-06-18T08:36:00Z</cp:lastPrinted>
+  <dcterms:created xsi:type="dcterms:W3CDTF">2026-04-14T08:33:00Z</dcterms:created>
+  <dcterms:modified xsi:type="dcterms:W3CDTF">2026-07-15T21:43:00Z</dcterms:modified>
+</cp:coreProperties>
+</file>
+
+<file path=word\document.xml><?xml version="1.0" encoding="utf-8"?>
 <w:document xmlns:wpc="http://schemas.microsoft.com/office/word/2010/wordprocessingCanvas" xmlns:cx="http://schemas.microsoft.com/office/drawing/2014/chartex" xmlns:cx1="http://schemas.microsoft.com/office/drawing/2015/9/8/chartex" xmlns:cx2="http://schemas.microsoft.com/office/drawing/2015/10/21/chartex" xmlns:cx3="http://schemas.microsoft.com/office/drawing/2016/5/9/chartex" xmlns:cx4="http://schemas.microsoft.com/office/drawing/2016/5/10/chartex" xmlns:cx5="http://schemas.microsoft.com/office/drawing/2016/5/11/chartex" xmlns:cx6="http://schemas.microsoft.com/office/drawing/2016/5/12/chartex" xmlns:cx7="http://schemas.microsoft.com/office/drawing/2016/5/13/chartex" xmlns:cx8="http://schemas.microsoft.com/office/drawing/2016/5/14/chartex" xmlns:mc="http://schemas.openxmlformats.org/markup-compatibility/2006" xmlns:aink="http://schemas.microsoft.com/office/drawing/2016/ink" xmlns:am3d="http://schemas.microsoft.com/office/drawing/2017/model3d" xmlns:o="urn:schemas-microsoft-com:office:office" xmlns:oel="http://schemas.microsoft.com/office/2019/extlst" xmlns:r="http://schemas.openxmlformats.org/officeDocument/2006/relationships" xmlns:m="http://schemas.openxmlformats.org/officeDocument/2006/math" xmlns:v="urn:schemas-microsoft-com:vml" xmlns:wp14="http://schemas.microsoft.com/office/word/2010/wordprocessingDrawing" xmlns:wp="http://schemas.openxmlformats.org/drawingml/2006/wordprocessingDrawing" xmlns:w10="urn:schemas-microsoft-com:office:word" xmlns:w="http://schemas.openxmlformats.org/wordprocessingml/2006/main" xmlns:w14="http://schemas.microsoft.com/office/word/2010/wordml" xmlns:w15="http://schemas.microsoft.com/office/word/2012/wordml" xmlns:w16cex="http://schemas.microsoft.com/office/word/2018/wordml/cex" xmlns:w16cid="http://schemas.microsoft.com/office/word/2016/wordml/cid" xmlns:w16="http://schemas.microsoft.com/office/word/2018/wordml" xmlns:w16sdtdh="http://schemas.microsoft.com/office/word/2020/wordml/sdtdatahash" xmlns:w16se="http://schemas.microsoft.com/office/word/2015/wordml/symex" xmlns:wpg="http://schemas.microsoft.com/office/word/2010/wordprocessingGroup" xmlns:wpi="http://schemas.microsoft.com/office/word/2010/wordprocessingInk" xmlns:wne="http://schemas.microsoft.com/office/word/2006/wordml" xmlns:wps="http://schemas.microsoft.com/office/word/2010/wordprocessingShape" mc:Ignorable="w14 w15 w16se w16cid w16 w16cex w16sdtdh wp14">
   <w:body>
     <w:tbl>
@@ -9729,7 +9792,7 @@
 </w:document>
 </file>
 
-<file path=word/endnotes.xml><?xml version="1.0" encoding="utf-8"?>
+<file path=word\endnotes.xml><?xml version="1.0" encoding="utf-8"?>
 <w:endnotes xmlns:wpc="http://schemas.microsoft.com/office/word/2010/wordprocessingCanvas" xmlns:cx="http://schemas.microsoft.com/office/drawing/2014/chartex" xmlns:cx1="http://schemas.microsoft.com/office/drawing/2015/9/8/chartex" xmlns:cx2="http://schemas.microsoft.com/office/drawing/2015/10/21/chartex" xmlns:cx3="http://schemas.microsoft.com/office/drawing/2016/5/9/chartex" xmlns:cx4="http://schemas.microsoft.com/office/drawing/2016/5/10/chartex" xmlns:cx5="http://schemas.microsoft.com/office/drawing/2016/5/11/chartex" xmlns:cx6="http://schemas.microsoft.com/office/drawing/2016/5/12/chartex" xmlns:cx7="http://schemas.microsoft.com/office/drawing/2016/5/13/chartex" xmlns:cx8="http://schemas.microsoft.com/office/drawing/2016/5/14/chartex" xmlns:mc="http://schemas.openxmlformats.org/markup-compatibility/2006" xmlns:aink="http://schemas.microsoft.com/office/drawing/2016/ink" xmlns:am3d="http://schemas.microsoft.com/office/drawing/2017/model3d" xmlns:o="urn:schemas-microsoft-com:office:office" xmlns:oel="http://schemas.microsoft.com/office/2019/extlst" xmlns:r="http://schemas.openxmlformats.org/officeDocument/2006/relationships" xmlns:m="http://schemas.openxmlformats.org/officeDocument/2006/math" xmlns:v="urn:schemas-microsoft-com:vml" xmlns:wp14="http://schemas.microsoft.com/office/word/2010/wordprocessingDrawing" xmlns:wp="http://schemas.openxmlformats.org/drawingml/2006/wordprocessingDrawing" xmlns:w10="urn:schemas-microsoft-com:office:word" xmlns:w="http://schemas.openxmlformats.org/wordprocessingml/2006/main" xmlns:w14="http://schemas.microsoft.com/office/word/2010/wordml" xmlns:w15="http://schemas.microsoft.com/office/word/2012/wordml" xmlns:w16cex="http://schemas.microsoft.com/office/word/2018/wordml/cex" xmlns:w16cid="http://schemas.microsoft.com/office/word/2016/wordml/cid" xmlns:w16="http://schemas.microsoft.com/office/word/2018/wordml" xmlns:w16sdtdh="http://schemas.microsoft.com/office/word/2020/wordml/sdtdatahash" xmlns:w16se="http://schemas.microsoft.com/office/word/2015/wordml/symex" xmlns:wpg="http://schemas.microsoft.com/office/word/2010/wordprocessingGroup" xmlns:wpi="http://schemas.microsoft.com/office/word/2010/wordprocessingInk" xmlns:wne="http://schemas.microsoft.com/office/word/2006/wordml" xmlns:wps="http://schemas.microsoft.com/office/word/2010/wordprocessingShape" mc:Ignorable="w14 w15 w16se w16cid w16 w16cex w16sdtdh wp14">
   <w:endnote w:type="separator" w:id="-1">
     <w:p>
@@ -9754,7 +9817,99 @@
 </w:endnotes>
 </file>
 
-<file path=word/footer1.xml><?xml version="1.0" encoding="utf-8"?>
+<file path=word\fontTable.xml><?xml version="1.0" encoding="utf-8"?>
+<w:fonts xmlns:mc="http://schemas.openxmlformats.org/markup-compatibility/2006" xmlns:r="http://schemas.openxmlformats.org/officeDocument/2006/relationships" xmlns:w="http://schemas.openxmlformats.org/wordprocessingml/2006/main" xmlns:w14="http://schemas.microsoft.com/office/word/2010/wordml" xmlns:w15="http://schemas.microsoft.com/office/word/2012/wordml" xmlns:w16cex="http://schemas.microsoft.com/office/word/2018/wordml/cex" xmlns:w16cid="http://schemas.microsoft.com/office/word/2016/wordml/cid" xmlns:w16="http://schemas.microsoft.com/office/word/2018/wordml" xmlns:w16sdtdh="http://schemas.microsoft.com/office/word/2020/wordml/sdtdatahash" xmlns:w16se="http://schemas.microsoft.com/office/word/2015/wordml/symex" mc:Ignorable="w14 w15 w16se w16cid w16 w16cex w16sdtdh">
+  <w:font w:name="Times New Roman">
+    <w:panose1 w:val="02020603050405020304"/>
+    <w:charset w:val="00"/>
+    <w:family w:val="roman"/>
+    <w:pitch w:val="variable"/>
+    <w:sig w:usb0="E0002EFF" w:usb1="C000785B" w:usb2="00000009" w:usb3="00000000" w:csb0="000001FF" w:csb1="00000000"/>
+  </w:font>
+  <w:font w:name="Arial Nova Cond">
+    <w:altName w:val="Arial Nova Cond"/>
+    <w:charset w:val="00"/>
+    <w:family w:val="swiss"/>
+    <w:pitch w:val="variable"/>
+    <w:sig w:usb0="0000028F" w:usb1="00000002" w:usb2="00000000" w:usb3="00000000" w:csb0="0000019F" w:csb1="00000000"/>
+  </w:font>
+  <w:font w:name="Calibri">
+    <w:panose1 w:val="020F0502020204030204"/>
+    <w:charset w:val="00"/>
+    <w:family w:val="swiss"/>
+    <w:pitch w:val="variable"/>
+    <w:sig w:usb0="E4002EFF" w:usb1="C200247B" w:usb2="00000009" w:usb3="00000000" w:csb0="000001FF" w:csb1="00000000"/>
+  </w:font>
+  <w:font w:name="Courier New">
+    <w:panose1 w:val="02070309020205020404"/>
+    <w:charset w:val="00"/>
+    <w:family w:val="modern"/>
+    <w:pitch w:val="fixed"/>
+    <w:sig w:usb0="E0002EFF" w:usb1="C0007843" w:usb2="00000009" w:usb3="00000000" w:csb0="000001FF" w:csb1="00000000"/>
+  </w:font>
+  <w:font w:name="Wingdings">
+    <w:panose1 w:val="05000000000000000000"/>
+    <w:charset w:val="02"/>
+    <w:family w:val="auto"/>
+    <w:pitch w:val="variable"/>
+    <w:sig w:usb0="00000000" w:usb1="10000000" w:usb2="00000000" w:usb3="00000000" w:csb0="80000000" w:csb1="00000000"/>
+  </w:font>
+  <w:font w:name="Symbol">
+    <w:panose1 w:val="05050102010706020507"/>
+    <w:charset w:val="02"/>
+    <w:family w:val="roman"/>
+    <w:pitch w:val="variable"/>
+    <w:sig w:usb0="00000000" w:usb1="10000000" w:usb2="00000000" w:usb3="00000000" w:csb0="80000000" w:csb1="00000000"/>
+  </w:font>
+  <w:font w:name="Arial">
+    <w:panose1 w:val="020B0604020202020204"/>
+    <w:charset w:val="00"/>
+    <w:family w:val="swiss"/>
+    <w:pitch w:val="variable"/>
+    <w:sig w:usb0="E0002EFF" w:usb1="C000785B" w:usb2="00000009" w:usb3="00000000" w:csb0="000001FF" w:csb1="00000000"/>
+  </w:font>
+  <w:font w:name="BookmanOldStyle">
+    <w:altName w:val="Cambria"/>
+    <w:panose1 w:val="00000000000000000000"/>
+    <w:charset w:val="00"/>
+    <w:family w:val="roman"/>
+    <w:notTrueType/>
+    <w:pitch w:val="default"/>
+  </w:font>
+  <w:font w:name="BookmanOldStyle-Bold">
+    <w:altName w:val="Cambria"/>
+    <w:panose1 w:val="00000000000000000000"/>
+    <w:charset w:val="00"/>
+    <w:family w:val="roman"/>
+    <w:notTrueType/>
+    <w:pitch w:val="default"/>
+  </w:font>
+  <w:font w:name="BookmanOldStyle-BoldItalic">
+    <w:altName w:val="Cambria"/>
+    <w:panose1 w:val="00000000000000000000"/>
+    <w:charset w:val="00"/>
+    <w:family w:val="roman"/>
+    <w:notTrueType/>
+    <w:pitch w:val="default"/>
+  </w:font>
+  <w:font w:name="Consolas">
+    <w:panose1 w:val="020B0609020204030204"/>
+    <w:charset w:val="00"/>
+    <w:family w:val="modern"/>
+    <w:pitch w:val="fixed"/>
+    <w:sig w:usb0="E00006FF" w:usb1="0000FCFF" w:usb2="00000001" w:usb3="00000000" w:csb0="0000019F" w:csb1="00000000"/>
+  </w:font>
+  <w:font w:name="Calibri Light">
+    <w:panose1 w:val="020F0302020204030204"/>
+    <w:charset w:val="00"/>
+    <w:family w:val="swiss"/>
+    <w:pitch w:val="variable"/>
+    <w:sig w:usb0="E4002EFF" w:usb1="C200247B" w:usb2="00000009" w:usb3="00000000" w:csb0="000001FF" w:csb1="00000000"/>
+  </w:font>
+</w:fonts>
+</file>
+
+<file path=word\footer1.xml><?xml version="1.0" encoding="utf-8"?>
 <w:ftr xmlns:wpc="http://schemas.microsoft.com/office/word/2010/wordprocessingCanvas" xmlns:cx="http://schemas.microsoft.com/office/drawing/2014/chartex" xmlns:cx1="http://schemas.microsoft.com/office/drawing/2015/9/8/chartex" xmlns:cx2="http://schemas.microsoft.com/office/drawing/2015/10/21/chartex" xmlns:cx3="http://schemas.microsoft.com/office/drawing/2016/5/9/chartex" xmlns:cx4="http://schemas.microsoft.com/office/drawing/2016/5/10/chartex" xmlns:cx5="http://schemas.microsoft.com/office/drawing/2016/5/11/chartex" xmlns:cx6="http://schemas.microsoft.com/office/drawing/2016/5/12/chartex" xmlns:cx7="http://schemas.microsoft.com/office/drawing/2016/5/13/chartex" xmlns:cx8="http://schemas.microsoft.com/office/drawing/2016/5/14/chartex" xmlns:mc="http://schemas.openxmlformats.org/markup-compatibility/2006" xmlns:aink="http://schemas.microsoft.com/office/drawing/2016/ink" xmlns:am3d="http://schemas.microsoft.com/office/drawing/2017/model3d" xmlns:o="urn:schemas-microsoft-com:office:office" xmlns:oel="http://schemas.microsoft.com/office/2019/extlst" xmlns:r="http://schemas.openxmlformats.org/officeDocument/2006/relationships" xmlns:m="http://schemas.openxmlformats.org/officeDocument/2006/math" xmlns:v="urn:schemas-microsoft-com:vml" xmlns:wp14="http://schemas.microsoft.com/office/word/2010/wordprocessingDrawing" xmlns:wp="http://schemas.openxmlformats.org/drawingml/2006/wordprocessingDrawing" xmlns:w10="urn:schemas-microsoft-com:office:word" xmlns:w="http://schemas.openxmlformats.org/wordprocessingml/2006/main" xmlns:w14="http://schemas.microsoft.com/office/word/2010/wordml" xmlns:w15="http://schemas.microsoft.com/office/word/2012/wordml" xmlns:w16cex="http://schemas.microsoft.com/office/word/2018/wordml/cex" xmlns:w16cid="http://schemas.microsoft.com/office/word/2016/wordml/cid" xmlns:w16="http://schemas.microsoft.com/office/word/2018/wordml" xmlns:w16sdtdh="http://schemas.microsoft.com/office/word/2020/wordml/sdtdatahash" xmlns:w16se="http://schemas.microsoft.com/office/word/2015/wordml/symex" xmlns:wpg="http://schemas.microsoft.com/office/word/2010/wordprocessingGroup" xmlns:wpi="http://schemas.microsoft.com/office/word/2010/wordprocessingInk" xmlns:wne="http://schemas.microsoft.com/office/word/2006/wordml" xmlns:wps="http://schemas.microsoft.com/office/word/2010/wordprocessingShape" mc:Ignorable="w14 w15 w16se w16cid w16 w16cex w16sdtdh wp14">
   <w:p>
     <w:pPr>
@@ -10292,7 +10447,7 @@
 </w:ftr>
 </file>
 
-<file path=word/footnotes.xml><?xml version="1.0" encoding="utf-8"?>
+<file path=word\footnotes.xml><?xml version="1.0" encoding="utf-8"?>
 <w:footnotes xmlns:wpc="http://schemas.microsoft.com/office/word/2010/wordprocessingCanvas" xmlns:cx="http://schemas.microsoft.com/office/drawing/2014/chartex" xmlns:cx1="http://schemas.microsoft.com/office/drawing/2015/9/8/chartex" xmlns:cx2="http://schemas.microsoft.com/office/drawing/2015/10/21/chartex" xmlns:cx3="http://schemas.microsoft.com/office/drawing/2016/5/9/chartex" xmlns:cx4="http://schemas.microsoft.com/office/drawing/2016/5/10/chartex" xmlns:cx5="http://schemas.microsoft.com/office/drawing/2016/5/11/chartex" xmlns:cx6="http://schemas.microsoft.com/office/drawing/2016/5/12/chartex" xmlns:cx7="http://schemas.microsoft.com/office/drawing/2016/5/13/chartex" xmlns:cx8="http://schemas.microsoft.com/office/drawing/2016/5/14/chartex" xmlns:mc="http://schemas.openxmlformats.org/markup-compatibility/2006" xmlns:aink="http://schemas.microsoft.com/office/drawing/2016/ink" xmlns:am3d="http://schemas.microsoft.com/office/drawing/2017/model3d" xmlns:o="urn:schemas-microsoft-com:office:office" xmlns:oel="http://schemas.microsoft.com/office/2019/extlst" xmlns:r="http://schemas.openxmlformats.org/officeDocument/2006/relationships" xmlns:m="http://schemas.openxmlformats.org/officeDocument/2006/math" xmlns:v="urn:schemas-microsoft-com:vml" xmlns:wp14="http://schemas.microsoft.com/office/word/2010/wordprocessingDrawing" xmlns:wp="http://schemas.openxmlformats.org/drawingml/2006/wordprocessingDrawing" xmlns:w10="urn:schemas-microsoft-com:office:word" xmlns:w="http://schemas.openxmlformats.org/wordprocessingml/2006/main" xmlns:w14="http://schemas.microsoft.com/office/word/2010/wordml" xmlns:w15="http://schemas.microsoft.com/office/word/2012/wordml" xmlns:w16cex="http://schemas.microsoft.com/office/word/2018/wordml/cex" xmlns:w16cid="http://schemas.microsoft.com/office/word/2016/wordml/cid" xmlns:w16="http://schemas.microsoft.com/office/word/2018/wordml" xmlns:w16sdtdh="http://schemas.microsoft.com/office/word/2020/wordml/sdtdatahash" xmlns:w16se="http://schemas.microsoft.com/office/word/2015/wordml/symex" xmlns:wpg="http://schemas.microsoft.com/office/word/2010/wordprocessingGroup" xmlns:wpi="http://schemas.microsoft.com/office/word/2010/wordprocessingInk" xmlns:wne="http://schemas.microsoft.com/office/word/2006/wordml" xmlns:wps="http://schemas.microsoft.com/office/word/2010/wordprocessingShape" mc:Ignorable="w14 w15 w16se w16cid w16 w16cex w16sdtdh wp14">
   <w:footnote w:type="separator" w:id="-1">
     <w:p>
@@ -10317,7 +10472,7 @@
 </w:footnotes>
 </file>
 
-<file path=word/numbering.xml><?xml version="1.0" encoding="utf-8"?>
+<file path=word\numbering.xml><?xml version="1.0" encoding="utf-8"?>
 <w:numbering xmlns:wpc="http://schemas.microsoft.com/office/word/2010/wordprocessingCanvas" xmlns:cx="http://schemas.microsoft.com/office/drawing/2014/chartex" xmlns:cx1="http://schemas.microsoft.com/office/drawing/2015/9/8/chartex" xmlns:cx2="http://schemas.microsoft.com/office/drawing/2015/10/21/chartex" xmlns:cx3="http://schemas.microsoft.com/office/drawing/2016/5/9/chartex" xmlns:cx4="http://schemas.microsoft.com/office/drawing/2016/5/10/chartex" xmlns:cx5="http://schemas.microsoft.com/office/drawing/2016/5/11/chartex" xmlns:cx6="http://schemas.microsoft.com/office/drawing/2016/5/12/chartex" xmlns:cx7="http://schemas.microsoft.com/office/drawing/2016/5/13/chartex" xmlns:cx8="http://schemas.microsoft.com/office/drawing/2016/5/14/chartex" xmlns:mc="http://schemas.openxmlformats.org/markup-compatibility/2006" xmlns:aink="http://schemas.microsoft.com/office/drawing/2016/ink" xmlns:am3d="http://schemas.microsoft.com/office/drawing/2017/model3d" xmlns:o="urn:schemas-microsoft-com:office:office" xmlns:oel="http://schemas.microsoft.com/office/2019/extlst" xmlns:r="http://schemas.openxmlformats.org/officeDocument/2006/relationships" xmlns:m="http://schemas.openxmlformats.org/officeDocument/2006/math" xmlns:v="urn:schemas-microsoft-com:vml" xmlns:wp14="http://schemas.microsoft.com/office/word/2010/wordprocessingDrawing" xmlns:wp="http://schemas.openxmlformats.org/drawingml/2006/wordprocessingDrawing" xmlns:w10="urn:schemas-microsoft-com:office:word" xmlns:w="http://schemas.openxmlformats.org/wordprocessingml/2006/main" xmlns:w14="http://schemas.microsoft.com/office/word/2010/wordml" xmlns:w15="http://schemas.microsoft.com/office/word/2012/wordml" xmlns:w16cex="http://schemas.microsoft.com/office/word/2018/wordml/cex" xmlns:w16cid="http://schemas.microsoft.com/office/word/2016/wordml/cid" xmlns:w16="http://schemas.microsoft.com/office/word/2018/wordml" xmlns:w16sdtdh="http://schemas.microsoft.com/office/word/2020/wordml/sdtdatahash" xmlns:w16se="http://schemas.microsoft.com/office/word/2015/wordml/symex" xmlns:wpg="http://schemas.microsoft.com/office/word/2010/wordprocessingGroup" xmlns:wpi="http://schemas.microsoft.com/office/word/2010/wordprocessingInk" xmlns:wne="http://schemas.microsoft.com/office/word/2006/wordml" xmlns:wps="http://schemas.microsoft.com/office/word/2010/wordprocessingShape" mc:Ignorable="w14 w15 w16se w16cid w16 w16cex w16sdtdh wp14">
   <w:abstractNum w:abstractNumId="0" w15:restartNumberingAfterBreak="0">
     <w:nsid w:val="017B7765"/>
@@ -13204,7 +13359,344 @@
 </w:numbering>
 </file>
 
-<file path=word/styles.xml><?xml version="1.0" encoding="utf-8"?>
+<file path=word\settings.xml><?xml version="1.0" encoding="utf-8"?>
+<w:settings xmlns:mc="http://schemas.openxmlformats.org/markup-compatibility/2006" xmlns:o="urn:schemas-microsoft-com:office:office" xmlns:r="http://schemas.openxmlformats.org/officeDocument/2006/relationships" xmlns:m="http://schemas.openxmlformats.org/officeDocument/2006/math" xmlns:v="urn:schemas-microsoft-com:vml" xmlns:w10="urn:schemas-microsoft-com:office:word" xmlns:w="http://schemas.openxmlformats.org/wordprocessingml/2006/main" xmlns:w14="http://schemas.microsoft.com/office/word/2010/wordml" xmlns:w15="http://schemas.microsoft.com/office/word/2012/wordml" xmlns:w16cex="http://schemas.microsoft.com/office/word/2018/wordml/cex" xmlns:w16cid="http://schemas.microsoft.com/office/word/2016/wordml/cid" xmlns:w16="http://schemas.microsoft.com/office/word/2018/wordml" xmlns:w16sdtdh="http://schemas.microsoft.com/office/word/2020/wordml/sdtdatahash" xmlns:w16se="http://schemas.microsoft.com/office/word/2015/wordml/symex" xmlns:sl="http://schemas.openxmlformats.org/schemaLibrary/2006/main" mc:Ignorable="w14 w15 w16se w16cid w16 w16cex w16sdtdh">
+  <w:zoom w:percent="100"/>
+  <w:defaultTabStop w:val="720"/>
+  <w:characterSpacingControl w:val="doNotCompress"/>
+  <w:hdrShapeDefaults>
+    <o:shapedefaults v:ext="edit" spidmax="2050"/>
+  </w:hdrShapeDefaults>
+  <w:footnotePr>
+    <w:footnote w:id="-1"/>
+    <w:footnote w:id="0"/>
+  </w:footnotePr>
+  <w:endnotePr>
+    <w:endnote w:id="-1"/>
+    <w:endnote w:id="0"/>
+  </w:endnotePr>
+  <w:compat>
+    <w:compatSetting w:name="compatibilityMode" w:uri="http://schemas.microsoft.com/office/word" w:val="15"/>
+    <w:compatSetting w:name="overrideTableStyleFontSizeAndJustification" w:uri="http://schemas.microsoft.com/office/word" w:val="1"/>
+    <w:compatSetting w:name="enableOpenTypeFeatures" w:uri="http://schemas.microsoft.com/office/word" w:val="1"/>
+    <w:compatSetting w:name="doNotFlipMirrorIndents" w:uri="http://schemas.microsoft.com/office/word" w:val="1"/>
+    <w:compatSetting w:name="differentiateMultirowTableHeaders" w:uri="http://schemas.microsoft.com/office/word" w:val="1"/>
+    <w:compatSetting w:name="useWord2013TrackBottomHyphenation" w:uri="http://schemas.microsoft.com/office/word" w:val="0"/>
+  </w:compat>
+  <w:rsids>
+    <w:rsidRoot w:val="007E0C43"/>
+    <w:rsid w:val="00006079"/>
+    <w:rsid w:val="00012AB5"/>
+    <w:rsid w:val="00024477"/>
+    <w:rsid w:val="000248BE"/>
+    <w:rsid w:val="00045316"/>
+    <w:rsid w:val="00054383"/>
+    <w:rsid w:val="0005461D"/>
+    <w:rsid w:val="00054FB1"/>
+    <w:rsid w:val="000550CE"/>
+    <w:rsid w:val="00057F67"/>
+    <w:rsid w:val="000724BF"/>
+    <w:rsid w:val="0007250B"/>
+    <w:rsid w:val="000754CE"/>
+    <w:rsid w:val="000B1819"/>
+    <w:rsid w:val="000B2C4D"/>
+    <w:rsid w:val="000B7D65"/>
+    <w:rsid w:val="000C7DBC"/>
+    <w:rsid w:val="000F057A"/>
+    <w:rsid w:val="000F7E67"/>
+    <w:rsid w:val="001019CE"/>
+    <w:rsid w:val="00102842"/>
+    <w:rsid w:val="00103466"/>
+    <w:rsid w:val="0010751E"/>
+    <w:rsid w:val="00137E79"/>
+    <w:rsid w:val="00147A39"/>
+    <w:rsid w:val="00180F9A"/>
+    <w:rsid w:val="00187C85"/>
+    <w:rsid w:val="001969DA"/>
+    <w:rsid w:val="001A2D6F"/>
+    <w:rsid w:val="001B0A7E"/>
+    <w:rsid w:val="001B4E65"/>
+    <w:rsid w:val="001C1757"/>
+    <w:rsid w:val="001C3F3E"/>
+    <w:rsid w:val="001C4278"/>
+    <w:rsid w:val="001C517B"/>
+    <w:rsid w:val="001C53E6"/>
+    <w:rsid w:val="001D21A3"/>
+    <w:rsid w:val="001D5B40"/>
+    <w:rsid w:val="001F2352"/>
+    <w:rsid w:val="001F6F7E"/>
+    <w:rsid w:val="00213134"/>
+    <w:rsid w:val="00221EDD"/>
+    <w:rsid w:val="00223E74"/>
+    <w:rsid w:val="002313EB"/>
+    <w:rsid w:val="002379C4"/>
+    <w:rsid w:val="00240251"/>
+    <w:rsid w:val="002511A1"/>
+    <w:rsid w:val="0025735B"/>
+    <w:rsid w:val="002644A2"/>
+    <w:rsid w:val="002725BE"/>
+    <w:rsid w:val="00275BB9"/>
+    <w:rsid w:val="00277883"/>
+    <w:rsid w:val="002B0718"/>
+    <w:rsid w:val="002C0BC1"/>
+    <w:rsid w:val="002C1D2C"/>
+    <w:rsid w:val="002D23F4"/>
+    <w:rsid w:val="002D614D"/>
+    <w:rsid w:val="002D671F"/>
+    <w:rsid w:val="002E1C8D"/>
+    <w:rsid w:val="002F04B8"/>
+    <w:rsid w:val="002F4D77"/>
+    <w:rsid w:val="002F4E05"/>
+    <w:rsid w:val="00302312"/>
+    <w:rsid w:val="0030425F"/>
+    <w:rsid w:val="00327DCB"/>
+    <w:rsid w:val="0036484E"/>
+    <w:rsid w:val="00372BB4"/>
+    <w:rsid w:val="0037584D"/>
+    <w:rsid w:val="003939D9"/>
+    <w:rsid w:val="003A1ABE"/>
+    <w:rsid w:val="003A3B54"/>
+    <w:rsid w:val="003A4DB6"/>
+    <w:rsid w:val="003A5186"/>
+    <w:rsid w:val="003A64F5"/>
+    <w:rsid w:val="003B0428"/>
+    <w:rsid w:val="003B2902"/>
+    <w:rsid w:val="003C005A"/>
+    <w:rsid w:val="003C067A"/>
+    <w:rsid w:val="003C4812"/>
+    <w:rsid w:val="003C4FBB"/>
+    <w:rsid w:val="003D4601"/>
+    <w:rsid w:val="003D6DD7"/>
+    <w:rsid w:val="003E709C"/>
+    <w:rsid w:val="00405C74"/>
+    <w:rsid w:val="0041631F"/>
+    <w:rsid w:val="004204AF"/>
+    <w:rsid w:val="004204FB"/>
+    <w:rsid w:val="00420EA2"/>
+    <w:rsid w:val="004234EA"/>
+    <w:rsid w:val="00423F3C"/>
+    <w:rsid w:val="004618A9"/>
+    <w:rsid w:val="0046475F"/>
+    <w:rsid w:val="004741E5"/>
+    <w:rsid w:val="00492F88"/>
+    <w:rsid w:val="004B398B"/>
+    <w:rsid w:val="004B4D63"/>
+    <w:rsid w:val="004C0D17"/>
+    <w:rsid w:val="004C67FC"/>
+    <w:rsid w:val="004D1A9D"/>
+    <w:rsid w:val="004D321A"/>
+    <w:rsid w:val="004D3FB1"/>
+    <w:rsid w:val="004E2DD3"/>
+    <w:rsid w:val="004F229A"/>
+    <w:rsid w:val="00502210"/>
+    <w:rsid w:val="00516891"/>
+    <w:rsid w:val="005258E0"/>
+    <w:rsid w:val="0053119E"/>
+    <w:rsid w:val="00532A9D"/>
+    <w:rsid w:val="00535351"/>
+    <w:rsid w:val="00572073"/>
+    <w:rsid w:val="00576FA8"/>
+    <w:rsid w:val="00593E60"/>
+    <w:rsid w:val="005A2FE1"/>
+    <w:rsid w:val="005A6DDA"/>
+    <w:rsid w:val="005C2187"/>
+    <w:rsid w:val="005C6313"/>
+    <w:rsid w:val="005D5B6A"/>
+    <w:rsid w:val="005E21AA"/>
+    <w:rsid w:val="00600E5B"/>
+    <w:rsid w:val="00601EEC"/>
+    <w:rsid w:val="0062650F"/>
+    <w:rsid w:val="006313A9"/>
+    <w:rsid w:val="006446EA"/>
+    <w:rsid w:val="00650D8A"/>
+    <w:rsid w:val="00657A8E"/>
+    <w:rsid w:val="006641DB"/>
+    <w:rsid w:val="006A1F93"/>
+    <w:rsid w:val="006A4AAF"/>
+    <w:rsid w:val="006A5EC8"/>
+    <w:rsid w:val="006C79C5"/>
+    <w:rsid w:val="006D3FC8"/>
+    <w:rsid w:val="006D4C56"/>
+    <w:rsid w:val="00702C92"/>
+    <w:rsid w:val="00706300"/>
+    <w:rsid w:val="007174BD"/>
+    <w:rsid w:val="007243F1"/>
+    <w:rsid w:val="00726115"/>
+    <w:rsid w:val="00730284"/>
+    <w:rsid w:val="00746318"/>
+    <w:rsid w:val="0074690A"/>
+    <w:rsid w:val="00747F55"/>
+    <w:rsid w:val="00760C5D"/>
+    <w:rsid w:val="00773B0E"/>
+    <w:rsid w:val="00775B03"/>
+    <w:rsid w:val="00783D56"/>
+    <w:rsid w:val="00785E2B"/>
+    <w:rsid w:val="007920BD"/>
+    <w:rsid w:val="007B5A77"/>
+    <w:rsid w:val="007C21B4"/>
+    <w:rsid w:val="007D0C2D"/>
+    <w:rsid w:val="007D11D6"/>
+    <w:rsid w:val="007E0C43"/>
+    <w:rsid w:val="007E513A"/>
+    <w:rsid w:val="007F11BD"/>
+    <w:rsid w:val="007F23C4"/>
+    <w:rsid w:val="007F2552"/>
+    <w:rsid w:val="007F34FA"/>
+    <w:rsid w:val="00820999"/>
+    <w:rsid w:val="00827F23"/>
+    <w:rsid w:val="008413FB"/>
+    <w:rsid w:val="008449B9"/>
+    <w:rsid w:val="00846B12"/>
+    <w:rsid w:val="00853405"/>
+    <w:rsid w:val="00867E8F"/>
+    <w:rsid w:val="0087201D"/>
+    <w:rsid w:val="00874FC3"/>
+    <w:rsid w:val="008965D7"/>
+    <w:rsid w:val="008A0F0A"/>
+    <w:rsid w:val="008A2747"/>
+    <w:rsid w:val="008B31EB"/>
+    <w:rsid w:val="008B40B5"/>
+    <w:rsid w:val="008C5714"/>
+    <w:rsid w:val="008D3D7C"/>
+    <w:rsid w:val="008E0281"/>
+    <w:rsid w:val="008F145F"/>
+    <w:rsid w:val="008F5E38"/>
+    <w:rsid w:val="009014BA"/>
+    <w:rsid w:val="00906029"/>
+    <w:rsid w:val="009244A4"/>
+    <w:rsid w:val="00940FD1"/>
+    <w:rsid w:val="00942135"/>
+    <w:rsid w:val="00942368"/>
+    <w:rsid w:val="00942B33"/>
+    <w:rsid w:val="0095546F"/>
+    <w:rsid w:val="0096093C"/>
+    <w:rsid w:val="00967620"/>
+    <w:rsid w:val="00990FCD"/>
+    <w:rsid w:val="009A0850"/>
+    <w:rsid w:val="009A5077"/>
+    <w:rsid w:val="009B7AB3"/>
+    <w:rsid w:val="009E7EEC"/>
+    <w:rsid w:val="00A0680A"/>
+    <w:rsid w:val="00A42C9A"/>
+    <w:rsid w:val="00A53240"/>
+    <w:rsid w:val="00A6647F"/>
+    <w:rsid w:val="00A72C08"/>
+    <w:rsid w:val="00A9130B"/>
+    <w:rsid w:val="00A977B7"/>
+    <w:rsid w:val="00AA1B89"/>
+    <w:rsid w:val="00AB2A8D"/>
+    <w:rsid w:val="00AB455D"/>
+    <w:rsid w:val="00AC28C7"/>
+    <w:rsid w:val="00AC6E49"/>
+    <w:rsid w:val="00AE7F8B"/>
+    <w:rsid w:val="00AF2F7E"/>
+    <w:rsid w:val="00B13AFA"/>
+    <w:rsid w:val="00B31D33"/>
+    <w:rsid w:val="00B4041E"/>
+    <w:rsid w:val="00B4319F"/>
+    <w:rsid w:val="00B5538D"/>
+    <w:rsid w:val="00B856EA"/>
+    <w:rsid w:val="00BA7736"/>
+    <w:rsid w:val="00BB7F0F"/>
+    <w:rsid w:val="00BE32C7"/>
+    <w:rsid w:val="00BE37BC"/>
+    <w:rsid w:val="00BE45B9"/>
+    <w:rsid w:val="00BF5625"/>
+    <w:rsid w:val="00C02CF0"/>
+    <w:rsid w:val="00C3175B"/>
+    <w:rsid w:val="00C33FF3"/>
+    <w:rsid w:val="00C414EA"/>
+    <w:rsid w:val="00C44223"/>
+    <w:rsid w:val="00C44A75"/>
+    <w:rsid w:val="00C821A6"/>
+    <w:rsid w:val="00C832F7"/>
+    <w:rsid w:val="00C90273"/>
+    <w:rsid w:val="00C9073D"/>
+    <w:rsid w:val="00C944E5"/>
+    <w:rsid w:val="00CC4C0E"/>
+    <w:rsid w:val="00CD2236"/>
+    <w:rsid w:val="00CD4472"/>
+    <w:rsid w:val="00CE33EC"/>
+    <w:rsid w:val="00D179D2"/>
+    <w:rsid w:val="00D26BAB"/>
+    <w:rsid w:val="00D26D43"/>
+    <w:rsid w:val="00D31B8E"/>
+    <w:rsid w:val="00D438E9"/>
+    <w:rsid w:val="00D61590"/>
+    <w:rsid w:val="00D62D67"/>
+    <w:rsid w:val="00D64B7D"/>
+    <w:rsid w:val="00D96889"/>
+    <w:rsid w:val="00DC477A"/>
+    <w:rsid w:val="00DD182E"/>
+    <w:rsid w:val="00DD7B42"/>
+    <w:rsid w:val="00DE0A9C"/>
+    <w:rsid w:val="00E23742"/>
+    <w:rsid w:val="00E26FDB"/>
+    <w:rsid w:val="00E323A4"/>
+    <w:rsid w:val="00E32464"/>
+    <w:rsid w:val="00E46880"/>
+    <w:rsid w:val="00E50F91"/>
+    <w:rsid w:val="00E53206"/>
+    <w:rsid w:val="00E5514E"/>
+    <w:rsid w:val="00E84BD9"/>
+    <w:rsid w:val="00E96953"/>
+    <w:rsid w:val="00EA39CB"/>
+    <w:rsid w:val="00EA5CC0"/>
+    <w:rsid w:val="00EC1FA6"/>
+    <w:rsid w:val="00EC460C"/>
+    <w:rsid w:val="00ED1BDA"/>
+    <w:rsid w:val="00ED23BE"/>
+    <w:rsid w:val="00ED65DE"/>
+    <w:rsid w:val="00EE4624"/>
+    <w:rsid w:val="00EE61A7"/>
+    <w:rsid w:val="00EF2CDE"/>
+    <w:rsid w:val="00F138E6"/>
+    <w:rsid w:val="00F21357"/>
+    <w:rsid w:val="00F407EE"/>
+    <w:rsid w:val="00F44E58"/>
+    <w:rsid w:val="00F5142A"/>
+    <w:rsid w:val="00F53B96"/>
+    <w:rsid w:val="00F7769F"/>
+    <w:rsid w:val="00F87343"/>
+    <w:rsid w:val="00FB770D"/>
+    <w:rsid w:val="00FC1635"/>
+    <w:rsid w:val="00FD1AB3"/>
+    <w:rsid w:val="00FD2609"/>
+    <w:rsid w:val="00FE0DC8"/>
+    <w:rsid w:val="00FE6085"/>
+    <w:rsid w:val="00FF5FC4"/>
+    <w:rsid w:val="00FF602E"/>
+  </w:rsids>
+  <m:mathPr>
+    <m:mathFont m:val="Cambria Math"/>
+    <m:brkBin m:val="before"/>
+    <m:brkBinSub m:val="--"/>
+    <m:smallFrac m:val="0"/>
+    <m:dispDef/>
+    <m:lMargin m:val="0"/>
+    <m:rMargin m:val="0"/>
+    <m:defJc m:val="centerGroup"/>
+    <m:wrapIndent m:val="1440"/>
+    <m:intLim m:val="subSup"/>
+    <m:naryLim m:val="undOvr"/>
+  </m:mathPr>
+  <w:themeFontLang w:val="en-ID"/>
+  <w:clrSchemeMapping w:bg1="light1" w:t1="dark1" w:bg2="light2" w:t2="dark2" w:accent1="accent1" w:accent2="accent2" w:accent3="accent3" w:accent4="accent4" w:accent5="accent5" w:accent6="accent6" w:hyperlink="hyperlink" w:followedHyperlink="followedHyperlink"/>
+  <w:shapeDefaults>
+    <o:shapedefaults v:ext="edit" spidmax="2050"/>
+    <o:shapelayout v:ext="edit">
+      <o:idmap v:ext="edit" data="2"/>
+    </o:shapelayout>
+  </w:shapeDefaults>
+  <w:decimalSymbol w:val=","/>
+  <w:listSeparator w:val=";"/>
+  <w14:docId w14:val="2B31487E"/>
+  <w15:chartTrackingRefBased/>
+  <w15:docId w15:val="{0459D5B2-3AC9-4BAF-AD32-CB4020914977}"/>
+</w:settings>
+</file>
+
+<file path=word\styles.xml><?xml version="1.0" encoding="utf-8"?>
 <w:styles xmlns:mc="http://schemas.openxmlformats.org/markup-compatibility/2006" xmlns:r="http://schemas.openxmlformats.org/officeDocument/2006/relationships" xmlns:w="http://schemas.openxmlformats.org/wordprocessingml/2006/main" xmlns:w14="http://schemas.microsoft.com/office/word/2010/wordml" xmlns:w15="http://schemas.microsoft.com/office/word/2012/wordml" xmlns:w16cex="http://schemas.microsoft.com/office/word/2018/wordml/cex" xmlns:w16cid="http://schemas.microsoft.com/office/word/2016/wordml/cid" xmlns:w16="http://schemas.microsoft.com/office/word/2018/wordml" xmlns:w16sdtdh="http://schemas.microsoft.com/office/word/2020/wordml/sdtdatahash" xmlns:w16se="http://schemas.microsoft.com/office/word/2015/wordml/symex" mc:Ignorable="w14 w15 w16se w16cid w16 w16cex w16sdtdh">
   <w:docDefaults>
     <w:rPrDefault>
@@ -13807,7 +14299,7 @@
 </w:styles>
 </file>
 
-<file path=word/theme/theme1.xml><?xml version="1.0" encoding="utf-8"?>
+<file path=word\theme\theme1.xml><?xml version="1.0" encoding="utf-8"?>
 <a:theme xmlns:a="http://schemas.openxmlformats.org/drawingml/2006/main" name="Office Theme">
   <a:themeElements>
     <a:clrScheme name="Office">
@@ -14102,14 +14594,206 @@
 </a:theme>
 </file>
 
-<file path=customXml/item1.xml><?xml version="1.0" encoding="utf-8"?>
-<b:Sources xmlns:b="http://schemas.openxmlformats.org/officeDocument/2006/bibliography" xmlns="http://schemas.openxmlformats.org/officeDocument/2006/bibliography" SelectedStyle="\APASixthEditionOfficeOnline.xsl" StyleName="APA" Version="6"/>
-</file>
-
-<file path=customXml/itemProps1.xml><?xml version="1.0" encoding="utf-8"?>
-<ds:datastoreItem xmlns:ds="http://schemas.openxmlformats.org/officeDocument/2006/customXml" ds:itemID="{11F36BC6-CF5E-4B03-A8CB-9D32D749DADC}">
-  <ds:schemaRefs>
-    <ds:schemaRef ds:uri="http://schemas.openxmlformats.org/officeDocument/2006/bibliography"/>
-  </ds:schemaRefs>
-</ds:datastoreItem>
+<file path=word\webSettings.xml><?xml version="1.0" encoding="utf-8"?>
+<w:webSettings xmlns:mc="http://schemas.openxmlformats.org/markup-compatibility/2006" xmlns:r="http://schemas.openxmlformats.org/officeDocument/2006/relationships" xmlns:w="http://schemas.openxmlformats.org/wordprocessingml/2006/main" xmlns:w14="http://schemas.microsoft.com/office/word/2010/wordml" xmlns:w15="http://schemas.microsoft.com/office/word/2012/wordml" xmlns:w16cex="http://schemas.microsoft.com/office/word/2018/wordml/cex" xmlns:w16cid="http://schemas.microsoft.com/office/word/2016/wordml/cid" xmlns:w16="http://schemas.microsoft.com/office/word/2018/wordml" xmlns:w16sdtdh="http://schemas.microsoft.com/office/word/2020/wordml/sdtdatahash" xmlns:w16se="http://schemas.microsoft.com/office/word/2015/wordml/symex" mc:Ignorable="w14 w15 w16se w16cid w16 w16cex w16sdtdh">
+  <w:divs>
+    <w:div w:id="369652210">
+      <w:bodyDiv w:val="1"/>
+      <w:marLeft w:val="0"/>
+      <w:marRight w:val="0"/>
+      <w:marTop w:val="0"/>
+      <w:marBottom w:val="0"/>
+      <w:divBdr>
+        <w:top w:val="none" w:sz="0" w:space="0" w:color="auto"/>
+        <w:left w:val="none" w:sz="0" w:space="0" w:color="auto"/>
+        <w:bottom w:val="none" w:sz="0" w:space="0" w:color="auto"/>
+        <w:right w:val="none" w:sz="0" w:space="0" w:color="auto"/>
+      </w:divBdr>
+    </w:div>
+    <w:div w:id="732310634">
+      <w:bodyDiv w:val="1"/>
+      <w:marLeft w:val="0"/>
+      <w:marRight w:val="0"/>
+      <w:marTop w:val="0"/>
+      <w:marBottom w:val="0"/>
+      <w:divBdr>
+        <w:top w:val="none" w:sz="0" w:space="0" w:color="auto"/>
+        <w:left w:val="none" w:sz="0" w:space="0" w:color="auto"/>
+        <w:bottom w:val="none" w:sz="0" w:space="0" w:color="auto"/>
+        <w:right w:val="none" w:sz="0" w:space="0" w:color="auto"/>
+      </w:divBdr>
+    </w:div>
+    <w:div w:id="872881931">
+      <w:bodyDiv w:val="1"/>
+      <w:marLeft w:val="0"/>
+      <w:marRight w:val="0"/>
+      <w:marTop w:val="0"/>
+      <w:marBottom w:val="0"/>
+      <w:divBdr>
+        <w:top w:val="none" w:sz="0" w:space="0" w:color="auto"/>
+        <w:left w:val="none" w:sz="0" w:space="0" w:color="auto"/>
+        <w:bottom w:val="none" w:sz="0" w:space="0" w:color="auto"/>
+        <w:right w:val="none" w:sz="0" w:space="0" w:color="auto"/>
+      </w:divBdr>
+    </w:div>
+    <w:div w:id="875891510">
+      <w:bodyDiv w:val="1"/>
+      <w:marLeft w:val="0"/>
+      <w:marRight w:val="0"/>
+      <w:marTop w:val="0"/>
+      <w:marBottom w:val="0"/>
+      <w:divBdr>
+        <w:top w:val="none" w:sz="0" w:space="0" w:color="auto"/>
+        <w:left w:val="none" w:sz="0" w:space="0" w:color="auto"/>
+        <w:bottom w:val="none" w:sz="0" w:space="0" w:color="auto"/>
+        <w:right w:val="none" w:sz="0" w:space="0" w:color="auto"/>
+      </w:divBdr>
+    </w:div>
+    <w:div w:id="882324686">
+      <w:bodyDiv w:val="1"/>
+      <w:marLeft w:val="0"/>
+      <w:marRight w:val="0"/>
+      <w:marTop w:val="0"/>
+      <w:marBottom w:val="0"/>
+      <w:divBdr>
+        <w:top w:val="none" w:sz="0" w:space="0" w:color="auto"/>
+        <w:left w:val="none" w:sz="0" w:space="0" w:color="auto"/>
+        <w:bottom w:val="none" w:sz="0" w:space="0" w:color="auto"/>
+        <w:right w:val="none" w:sz="0" w:space="0" w:color="auto"/>
+      </w:divBdr>
+    </w:div>
+    <w:div w:id="889732518">
+      <w:bodyDiv w:val="1"/>
+      <w:marLeft w:val="0"/>
+      <w:marRight w:val="0"/>
+      <w:marTop w:val="0"/>
+      <w:marBottom w:val="0"/>
+      <w:divBdr>
+        <w:top w:val="none" w:sz="0" w:space="0" w:color="auto"/>
+        <w:left w:val="none" w:sz="0" w:space="0" w:color="auto"/>
+        <w:bottom w:val="none" w:sz="0" w:space="0" w:color="auto"/>
+        <w:right w:val="none" w:sz="0" w:space="0" w:color="auto"/>
+      </w:divBdr>
+    </w:div>
+    <w:div w:id="1016737439">
+      <w:bodyDiv w:val="1"/>
+      <w:marLeft w:val="0"/>
+      <w:marRight w:val="0"/>
+      <w:marTop w:val="0"/>
+      <w:marBottom w:val="0"/>
+      <w:divBdr>
+        <w:top w:val="none" w:sz="0" w:space="0" w:color="auto"/>
+        <w:left w:val="none" w:sz="0" w:space="0" w:color="auto"/>
+        <w:bottom w:val="none" w:sz="0" w:space="0" w:color="auto"/>
+        <w:right w:val="none" w:sz="0" w:space="0" w:color="auto"/>
+      </w:divBdr>
+    </w:div>
+    <w:div w:id="1038745694">
+      <w:bodyDiv w:val="1"/>
+      <w:marLeft w:val="0"/>
+      <w:marRight w:val="0"/>
+      <w:marTop w:val="0"/>
+      <w:marBottom w:val="0"/>
+      <w:divBdr>
+        <w:top w:val="none" w:sz="0" w:space="0" w:color="auto"/>
+        <w:left w:val="none" w:sz="0" w:space="0" w:color="auto"/>
+        <w:bottom w:val="none" w:sz="0" w:space="0" w:color="auto"/>
+        <w:right w:val="none" w:sz="0" w:space="0" w:color="auto"/>
+      </w:divBdr>
+    </w:div>
+    <w:div w:id="1191457315">
+      <w:bodyDiv w:val="1"/>
+      <w:marLeft w:val="0"/>
+      <w:marRight w:val="0"/>
+      <w:marTop w:val="0"/>
+      <w:marBottom w:val="0"/>
+      <w:divBdr>
+        <w:top w:val="none" w:sz="0" w:space="0" w:color="auto"/>
+        <w:left w:val="none" w:sz="0" w:space="0" w:color="auto"/>
+        <w:bottom w:val="none" w:sz="0" w:space="0" w:color="auto"/>
+        <w:right w:val="none" w:sz="0" w:space="0" w:color="auto"/>
+      </w:divBdr>
+    </w:div>
+    <w:div w:id="1283726794">
+      <w:bodyDiv w:val="1"/>
+      <w:marLeft w:val="0"/>
+      <w:marRight w:val="0"/>
+      <w:marTop w:val="0"/>
+      <w:marBottom w:val="0"/>
+      <w:divBdr>
+        <w:top w:val="none" w:sz="0" w:space="0" w:color="auto"/>
+        <w:left w:val="none" w:sz="0" w:space="0" w:color="auto"/>
+        <w:bottom w:val="none" w:sz="0" w:space="0" w:color="auto"/>
+        <w:right w:val="none" w:sz="0" w:space="0" w:color="auto"/>
+      </w:divBdr>
+    </w:div>
+    <w:div w:id="1563757839">
+      <w:bodyDiv w:val="1"/>
+      <w:marLeft w:val="0"/>
+      <w:marRight w:val="0"/>
+      <w:marTop w:val="0"/>
+      <w:marBottom w:val="0"/>
+      <w:divBdr>
+        <w:top w:val="none" w:sz="0" w:space="0" w:color="auto"/>
+        <w:left w:val="none" w:sz="0" w:space="0" w:color="auto"/>
+        <w:bottom w:val="none" w:sz="0" w:space="0" w:color="auto"/>
+        <w:right w:val="none" w:sz="0" w:space="0" w:color="auto"/>
+      </w:divBdr>
+    </w:div>
+    <w:div w:id="1640259069">
+      <w:bodyDiv w:val="1"/>
+      <w:marLeft w:val="0"/>
+      <w:marRight w:val="0"/>
+      <w:marTop w:val="0"/>
+      <w:marBottom w:val="0"/>
+      <w:divBdr>
+        <w:top w:val="none" w:sz="0" w:space="0" w:color="auto"/>
+        <w:left w:val="none" w:sz="0" w:space="0" w:color="auto"/>
+        <w:bottom w:val="none" w:sz="0" w:space="0" w:color="auto"/>
+        <w:right w:val="none" w:sz="0" w:space="0" w:color="auto"/>
+      </w:divBdr>
+    </w:div>
+    <w:div w:id="1872109267">
+      <w:bodyDiv w:val="1"/>
+      <w:marLeft w:val="0"/>
+      <w:marRight w:val="0"/>
+      <w:marTop w:val="0"/>
+      <w:marBottom w:val="0"/>
+      <w:divBdr>
+        <w:top w:val="none" w:sz="0" w:space="0" w:color="auto"/>
+        <w:left w:val="none" w:sz="0" w:space="0" w:color="auto"/>
+        <w:bottom w:val="none" w:sz="0" w:space="0" w:color="auto"/>
+        <w:right w:val="none" w:sz="0" w:space="0" w:color="auto"/>
+      </w:divBdr>
+    </w:div>
+    <w:div w:id="1923641531">
+      <w:bodyDiv w:val="1"/>
+      <w:marLeft w:val="0"/>
+      <w:marRight w:val="0"/>
+      <w:marTop w:val="0"/>
+      <w:marBottom w:val="0"/>
+      <w:divBdr>
+        <w:top w:val="none" w:sz="0" w:space="0" w:color="auto"/>
+        <w:left w:val="none" w:sz="0" w:space="0" w:color="auto"/>
+        <w:bottom w:val="none" w:sz="0" w:space="0" w:color="auto"/>
+        <w:right w:val="none" w:sz="0" w:space="0" w:color="auto"/>
+      </w:divBdr>
+    </w:div>
+    <w:div w:id="2076781062">
+      <w:bodyDiv w:val="1"/>
+      <w:marLeft w:val="0"/>
+      <w:marRight w:val="0"/>
+      <w:marTop w:val="0"/>
+      <w:marBottom w:val="0"/>
+      <w:divBdr>
+        <w:top w:val="none" w:sz="0" w:space="0" w:color="auto"/>
+        <w:left w:val="none" w:sz="0" w:space="0" w:color="auto"/>
+        <w:bottom w:val="none" w:sz="0" w:space="0" w:color="auto"/>
+        <w:right w:val="none" w:sz="0" w:space="0" w:color="auto"/>
+      </w:divBdr>
+    </w:div>
+  </w:divs>
+  <w:optimizeForBrowser/>
+  <w:allowPNG/>
+</w:webSettings>
 </file>
</xml_diff>